<commit_message>
Fix Fabric engine section: separate real data movement from pipeline registration
Both deliverables previously implied the Data Factory pipeline item moved
the data. Corrected: the physical OneLake upload happened via a direct
storage-API Python script (src/fabric/upload_to_onelake.py); the pipeline
item is genuinely registered via the Fabric API but wasn't configured with
activities and run. The separate pipeline template
(fabric_data_factory_pipeline_template.json) shows the intended production
design and is now labelled as a design, not executed fact. Also clarifies
the Gold-layer star schema is implemented today as a local SQLite
warehouse, with the Fabric DDL as the equivalent starter script.
</commit_message>
<xml_diff>
--- a/artifacts/reports/Leatt_Growth_OS_Data_Story.docx
+++ b/artifacts/reports/Leatt_Growth_OS_Data_Story.docx
@@ -219,7 +219,7 @@
         <w:pStyle w:val="Heading1"/>
       </w:pPr>
       <w:r>
-        <w:t>2. The engine: a real Microsoft Fabric deployment</w:t>
+        <w:t>2. The engine: what's real, and how data actually moves</w:t>
       </w:r>
     </w:p>
     <w:p>
@@ -232,7 +232,7 @@
           <w:i w:val="0"/>
           <w:sz w:val="22"/>
         </w:rPr>
-        <w:t>This is a genuine Fabric deployment, not a diagram of one. A capacity, workspace, Lakehouse, Data Factory pipeline item and Power BI report were created through the actual Fabric REST APIs, with real files uploaded into OneLake:</w:t>
+        <w:t>A capacity, workspace, Lakehouse and Power BI report were created through the actual Fabric REST APIs — genuine, live items in the tenant, not a diagram of them:</w:t>
       </w:r>
     </w:p>
     <w:p>
@@ -249,14 +249,6 @@
       </w:pPr>
       <w:r>
         <w:t>Lakehouse “Leatt_BI_ML_Lakehouse” — dca60749-eaef-410e-9121-ea16eedbc975</w:t>
-      </w:r>
-    </w:p>
-    <w:p>
-      <w:pPr>
-        <w:pStyle w:val="ListBullet"/>
-      </w:pPr>
-      <w:r>
-        <w:t>Data Factory pipeline “pl_leatt_million_row_lakehouse_load” — 9e82c185-e0ac-485d-9810-4bccdcfe6cf9</w:t>
       </w:r>
     </w:p>
     <w:p>
@@ -285,7 +277,21 @@
           <w:i w:val="0"/>
           <w:sz w:val="22"/>
         </w:rPr>
-        <w:t>OneLake Bronze/Silver files actually uploaded: the 90.7MB, 2,000,000-row transaction parquet; an 8.9MB, 11,354-variant product catalog; a 13.5MB, 180,000-row synthetic customer file; and a 31.0MB customer ML-score file.</w:t>
+        <w:t>How the data actually moved: a Python script (src/fabric/upload_to_onelake.py) authenticated with an Azure CLI token and called OneLake's storage REST API directly (create-directory, append, flush) to push files into Bronze/Silver — this is the real, verified transfer mechanism, confirmed by matching byte counts on both ends: the 90.7MB, 2,000,000-row transaction parquet; an 8.9MB, 11,354-variant product catalog; a 13.5MB, 180,000-row synthetic customer file; and a 31.0MB customer ML-score file.</w:t>
+      </w:r>
+    </w:p>
+    <w:p>
+      <w:pPr>
+        <w:spacing w:after="160"/>
+      </w:pPr>
+      <w:r>
+        <w:rPr>
+          <w:b w:val="0"/>
+          <w:i/>
+          <w:color w:val="6E6E6E"/>
+          <w:sz w:val="19"/>
+        </w:rPr>
+        <w:t>A Fabric Data Factory pipeline item (pl_leatt_million_row_lakehouse_load, 9e82c185-e0ac-485d-9810-4bccdcfe6cf9) is genuinely registered in the workspace via the Fabric API, proving the integration exists — but it was not configured with copy activities and run; the physical move above happened via the script. A separate, fully designed pipeline template (src/fabric/fabric_data_factory_pipeline_template.json) specifies what a production build would do: a Copy activity pulling Leatt's live Shopify product API into Bronze, a Copy activity landing the transaction parquet into Bronze, and a Notebook activity building the Silver Delta table — presented here as a design, not as something proven to have executed.</w:t>
       </w:r>
     </w:p>
     <w:p>
@@ -339,7 +345,7 @@
           <w:color w:val="6E6E6E"/>
           <w:sz w:val="18"/>
         </w:rPr>
-        <w:t>Figure 3 — Bronze → Silver → Gold medallion flow implemented in this workspace.</w:t>
+        <w:t>Figure 3 — The intended Bronze -&gt; Silver -&gt; Gold medallion flow (design target; Bronze/Silver landing is real, Gold is modelled locally today).</w:t>
       </w:r>
     </w:p>
     <w:p>
@@ -393,7 +399,7 @@
           <w:color w:val="6E6E6E"/>
           <w:sz w:val="18"/>
         </w:rPr>
-        <w:t>Figure 4 — Star schema serving the Lakehouse/Power BI semantic model.</w:t>
+        <w:t>Figure 4 — Star schema. Implemented today as a local SQLite warehouse; fabric_lakehouse_warehouse_ddl.sql is the equivalent starter DDL for Fabric.</w:t>
       </w:r>
     </w:p>
     <w:p>

</xml_diff>